<commit_message>
changes by the latest requirement
</commit_message>
<xml_diff>
--- a/backend/pilot_blanks/obrazac6/obrazac6_direktor.docx
+++ b/backend/pilot_blanks/obrazac6/obrazac6_direktor.docx
@@ -40,84 +40,7 @@
         </w:rPr>
       </w:pPr>
       <w:r>
-        <w:rPr>
-          <w:rFonts w:ascii="Calibri Light" w:hAnsi="Calibri Light" w:cs="Calibri Light"/>
-          <w:b/>
-          <w:sz w:val="22"/>
-          <w:szCs w:val="22"/>
-          <w:lang w:val="pl-PL"/>
-        </w:rPr>
-        <w:t>P</w:t>
-      </w:r>
-      <w:r>
-        <w:rPr>
-          <w:rFonts w:ascii="Calibri Light" w:hAnsi="Calibri Light" w:cs="Calibri Light"/>
-          <w:b/>
-          <w:sz w:val="22"/>
-          <w:szCs w:val="22"/>
-          <w:lang w:val="pl-PL"/>
-        </w:rPr>
-        <w:t>RIVREDNO DRUŠTVO UKRAS DOO</w:t>
-      </w:r>
-      <w:r>
-        <w:rPr>
-          <w:rFonts w:ascii="Calibri Light" w:hAnsi="Calibri Light" w:cs="Calibri Light"/>
-          <w:b/>
-          <w:sz w:val="22"/>
-          <w:szCs w:val="22"/>
-          <w:lang w:val="pl-PL"/>
-        </w:rPr>
-        <w:t xml:space="preserve">                     </w:t>
-      </w:r>
-      <w:r>
-        <w:rPr>
-          <w:rFonts w:ascii="Calibri Light" w:hAnsi="Calibri Light" w:cs="Calibri Light"/>
-          <w:b/>
-          <w:sz w:val="22"/>
-          <w:szCs w:val="22"/>
-          <w:lang w:val="pl-PL"/>
-        </w:rPr>
-        <w:t xml:space="preserve">                                  Veliki Popović bb</w:t>
-      </w:r>
-      <w:r>
-        <w:rPr>
-          <w:rFonts w:ascii="Calibri Light" w:hAnsi="Calibri Light" w:cs="Calibri Light"/>
-          <w:b/>
-          <w:sz w:val="22"/>
-          <w:szCs w:val="22"/>
-          <w:lang w:val="pl-PL"/>
-        </w:rPr>
-        <w:t xml:space="preserve">                            </w:t>
-      </w:r>
-      <w:r>
-        <w:rPr>
-          <w:rFonts w:ascii="Calibri Light" w:hAnsi="Calibri Light" w:cs="Calibri Light"/>
-          <w:b/>
-          <w:sz w:val="22"/>
-          <w:szCs w:val="22"/>
-          <w:lang w:val="pl-PL"/>
-        </w:rPr>
-        <w:t xml:space="preserve">      </w:t>
-      </w:r>
-      <w:r>
-        <w:rPr>
-          <w:rFonts w:ascii="Calibri Light" w:hAnsi="Calibri Light" w:cs="Calibri Light"/>
-          <w:b/>
-          <w:sz w:val="22"/>
-          <w:szCs w:val="22"/>
-          <w:lang w:val="pl-PL"/>
-        </w:rPr>
-        <w:t xml:space="preserve">         </w:t>
-      </w:r>
-      <w:r>
-        <w:rPr>
-          <w:rFonts w:ascii="Calibri Light" w:eastAsia="Calibri" w:hAnsi="Calibri Light" w:cs="Calibri Light"/>
-          <w:b/>
-          <w:sz w:val="22"/>
-          <w:szCs w:val="22"/>
-          <w:lang w:val="sr-Latn-RS"/>
-        </w:rPr>
-        <w:t>106612366</w:t>
+        <w:t xml:space="preserve">                                                                                                  </w:t>
       </w:r>
     </w:p>
     <w:p>
@@ -693,9 +616,7 @@
             <w:gridSpan w:val="2"/>
             <w:vAlign w:val="center"/>
           </w:tcPr>
-          <w:p>
-            <w:r/>
-          </w:p>
+          <w:p/>
         </w:tc>
       </w:tr>
       <w:tr>
@@ -2612,33 +2533,25 @@
             <w:tcW w:w="2268" w:type="dxa"/>
             <w:vAlign w:val="center"/>
           </w:tcPr>
-          <w:p>
-            <w:r/>
-          </w:p>
+          <w:p/>
         </w:tc>
         <w:tc>
           <w:tcPr>
             <w:tcW w:w="2520" w:type="dxa"/>
           </w:tcPr>
-          <w:p>
-            <w:r/>
-          </w:p>
+          <w:p/>
         </w:tc>
         <w:tc>
           <w:tcPr>
             <w:tcW w:w="3060" w:type="dxa"/>
           </w:tcPr>
-          <w:p>
-            <w:r/>
-          </w:p>
+          <w:p/>
         </w:tc>
         <w:tc>
           <w:tcPr>
             <w:tcW w:w="3140" w:type="dxa"/>
           </w:tcPr>
-          <w:p>
-            <w:r/>
-          </w:p>
+          <w:p/>
         </w:tc>
       </w:tr>
       <w:tr>
@@ -13512,74 +13425,7 @@
         </w:rPr>
       </w:pPr>
       <w:r>
-        <w:rPr>
-          <w:rFonts w:ascii="Calibri Light" w:hAnsi="Calibri Light" w:cs="Calibri Light"/>
-          <w:b/>
-          <w:sz w:val="22"/>
-          <w:szCs w:val="22"/>
-          <w:lang w:val="pl-PL"/>
-        </w:rPr>
-        <w:t>P</w:t>
-      </w:r>
-      <w:r>
-        <w:rPr>
-          <w:rFonts w:ascii="Calibri Light" w:hAnsi="Calibri Light" w:cs="Calibri Light"/>
-          <w:b/>
-          <w:sz w:val="22"/>
-          <w:szCs w:val="22"/>
-          <w:lang w:val="pl-PL"/>
-        </w:rPr>
-        <w:t>RIVREDNO DRUŠTVO UKRAS DOO</w:t>
-      </w:r>
-      <w:r>
-        <w:rPr>
-          <w:rFonts w:ascii="Calibri Light" w:hAnsi="Calibri Light" w:cs="Calibri Light"/>
-          <w:b/>
-          <w:sz w:val="22"/>
-          <w:szCs w:val="22"/>
-          <w:lang w:val="pl-PL"/>
-        </w:rPr>
-        <w:t xml:space="preserve">                     </w:t>
-      </w:r>
-      <w:r>
-        <w:rPr>
-          <w:rFonts w:ascii="Calibri Light" w:hAnsi="Calibri Light" w:cs="Calibri Light"/>
-          <w:b/>
-          <w:sz w:val="22"/>
-          <w:szCs w:val="22"/>
-          <w:lang w:val="pl-PL"/>
-        </w:rPr>
-        <w:t xml:space="preserve">                                  Veliki Popović bb</w:t>
-      </w:r>
-      <w:r>
-        <w:rPr>
-          <w:rFonts w:ascii="Calibri Light" w:hAnsi="Calibri Light" w:cs="Calibri Light"/>
-          <w:b/>
-          <w:sz w:val="22"/>
-          <w:szCs w:val="22"/>
-          <w:lang w:val="pl-PL"/>
-        </w:rPr>
-        <w:t xml:space="preserve">                                  </w:t>
-      </w:r>
-      <w:r>
-        <w:rPr>
-          <w:rFonts w:ascii="Calibri Light" w:hAnsi="Calibri Light" w:cs="Calibri Light"/>
-          <w:b/>
-          <w:sz w:val="22"/>
-          <w:szCs w:val="22"/>
-          <w:lang w:val="pl-PL"/>
-        </w:rPr>
-        <w:t xml:space="preserve">         </w:t>
-      </w:r>
-      <w:r>
-        <w:rPr>
-          <w:rFonts w:ascii="Calibri Light" w:eastAsia="Calibri" w:hAnsi="Calibri Light" w:cs="Calibri Light"/>
-          <w:b/>
-          <w:sz w:val="22"/>
-          <w:szCs w:val="22"/>
-          <w:lang w:val="sr-Latn-RS"/>
-        </w:rPr>
-        <w:t>106612366</w:t>
+        <w:t xml:space="preserve">                                                                                                  </w:t>
       </w:r>
     </w:p>
     <w:p>

</xml_diff>